<commit_message>
teste com modelos reglog, random forest e xgboost + script com modelo salvo
</commit_message>
<xml_diff>
--- a/dados_resultado/relatorio_predicao_churn.docx
+++ b/dados_resultado/relatorio_predicao_churn.docx
@@ -391,7 +391,10 @@
         <w:pStyle w:val="Ttulo2"/>
       </w:pPr>
       <w:r>
-        <w:t>Identificação Antecipada (Sensibilidade)</w:t>
+        <w:t>Recall</w:t>
+      </w:r>
+      <w:r>
+        <w:t xml:space="preserve"> (Sensibilidade)</w:t>
       </w:r>
     </w:p>
     <w:p>
@@ -454,7 +457,10 @@
         <w:pStyle w:val="Ttulo2"/>
       </w:pPr>
       <w:r>
-        <w:t>Confiança do Alerta (Precisão)</w:t>
+        <w:t>Precisão (</w:t>
+      </w:r>
+      <w:r>
+        <w:t>Confiança do Alerta)</w:t>
       </w:r>
     </w:p>
     <w:p>
@@ -467,43 +473,7 @@
         <w:rPr>
           <w:lang w:val="pt-BR"/>
         </w:rPr>
-        <w:t xml:space="preserve">Quando o modelo </w:t>
-      </w:r>
-      <w:r>
-        <w:rPr>
-          <w:lang w:val="pt-BR"/>
-        </w:rPr>
-        <w:t>indicou</w:t>
-      </w:r>
-      <w:r>
-        <w:rPr>
-          <w:lang w:val="pt-BR"/>
-        </w:rPr>
-        <w:t xml:space="preserve"> que </w:t>
-      </w:r>
-      <w:r>
-        <w:rPr>
-          <w:lang w:val="pt-BR"/>
-        </w:rPr>
-        <w:t>um cliente iria</w:t>
-      </w:r>
-      <w:r>
-        <w:rPr>
-          <w:lang w:val="pt-BR"/>
-        </w:rPr>
-        <w:t xml:space="preserve"> cancelar ele </w:t>
-      </w:r>
-      <w:r>
-        <w:rPr>
-          <w:lang w:val="pt-BR"/>
-        </w:rPr>
-        <w:t>acertou</w:t>
-      </w:r>
-      <w:r>
-        <w:rPr>
-          <w:lang w:val="pt-BR"/>
-        </w:rPr>
-        <w:t xml:space="preserve"> 8</w:t>
+        <w:t>Quando o modelo indicou que um cliente iria cancelar ele acertou 8</w:t>
       </w:r>
       <w:r>
         <w:rPr>
@@ -539,19 +509,7 @@
         <w:rPr>
           <w:lang w:val="pt-BR"/>
         </w:rPr>
-        <w:t xml:space="preserve"> eram de fato clientes que</w:t>
-      </w:r>
-      <w:r>
-        <w:rPr>
-          <w:lang w:val="pt-BR"/>
-        </w:rPr>
-        <w:t xml:space="preserve"> cancelaram</w:t>
-      </w:r>
-      <w:r>
-        <w:rPr>
-          <w:lang w:val="pt-BR"/>
-        </w:rPr>
-        <w:t>. Nos outros 1</w:t>
+        <w:t xml:space="preserve"> eram de fato clientes que cancelaram. Nos outros 1</w:t>
       </w:r>
       <w:r>
         <w:rPr>
@@ -575,19 +533,7 @@
         <w:rPr>
           <w:lang w:val="pt-BR"/>
         </w:rPr>
-        <w:t xml:space="preserve">% de alarmes falsos), o modelo indicou risco para um cliente que acabou continuando ativo. Para o negócio, o custo desse erro é </w:t>
-      </w:r>
-      <w:r>
-        <w:rPr>
-          <w:lang w:val="pt-BR"/>
-        </w:rPr>
-        <w:t>baixo</w:t>
-      </w:r>
-      <w:r>
-        <w:rPr>
-          <w:lang w:val="pt-BR"/>
-        </w:rPr>
-        <w:t>: significa apenas que o time de CS fará uma ligação proativa de acompanhamento para um cliente saudável, o que melhora o relacionamento de qualquer forma.</w:t>
+        <w:t>% de alarmes falsos), o modelo indicou risco para um cliente que acabou continuando ativo. Para o negócio, o custo desse erro é baixo: significa apenas que o time de CS fará uma ligação proativa de acompanhamento para um cliente saudável, o que melhora o relacionamento de qualquer forma.</w:t>
       </w:r>
     </w:p>
     <w:p>
@@ -608,19 +554,7 @@
         <w:rPr>
           <w:lang w:val="pt-BR"/>
         </w:rPr>
-        <w:t xml:space="preserve">Considerando o total de </w:t>
-      </w:r>
-      <w:r>
-        <w:rPr>
-          <w:lang w:val="pt-BR"/>
-        </w:rPr>
-        <w:t>1.167</w:t>
-      </w:r>
-      <w:r>
-        <w:rPr>
-          <w:lang w:val="pt-BR"/>
-        </w:rPr>
-        <w:t xml:space="preserve"> clientes do teste o modelo acertou a situação em 953 casos, sendo 344 ativos e 609 cancelados, o que resulta em 82% de acurácia.</w:t>
+        <w:t>Considerando o total de 1.167 clientes do teste o modelo acertou a situação em 953 casos, sendo 344 ativos e 609 cancelados, o que resulta em 82% de acurácia.</w:t>
       </w:r>
     </w:p>
     <w:p>
@@ -3661,6 +3595,7 @@
   <w:style w:type="character" w:default="1" w:styleId="Fontepargpadro">
     <w:name w:val="Default Paragraph Font"/>
     <w:uiPriority w:val="1"/>
+    <w:semiHidden/>
     <w:unhideWhenUsed/>
   </w:style>
   <w:style w:type="table" w:default="1" w:styleId="Tabelanormal">

</xml_diff>